<commit_message>
Add comprehensive documentation and project details for Huann Almeida's portfolio
- Created and added a detailed CV in both DOCX and PDF formats, highlighting professional experience, technical skills, and education.
- Developed an English version of the CV to cater to a broader audience.
- Included a JSON file listing various full-stack projects with descriptions and repository links, showcasing technical expertise and project contributions.
- Updated existing documents to reflect recent experiences and skills, including automation projects and leadership roles.
</commit_message>
<xml_diff>
--- a/public/files/editableDocs/Huann Almeida EN.docx
+++ b/public/files/editableDocs/Huann Almeida EN.docx
@@ -405,8 +405,17 @@
           <w:sz w:val="20"/>
           <w:szCs w:val="20"/>
         </w:rPr>
-        <w:t>React, Angular, Next.js, HTML5, CSS3, TailwindCSS</w:t>
-      </w:r>
+        <w:t xml:space="preserve">React, Angular, Next.js, HTML5, CSS3, </w:t>
+      </w:r>
+      <w:proofErr w:type="spellStart"/>
+      <w:r>
+        <w:rPr>
+          <w:sz w:val="20"/>
+          <w:szCs w:val="20"/>
+        </w:rPr>
+        <w:t>TailwindCSS</w:t>
+      </w:r>
+      <w:proofErr w:type="spellEnd"/>
       <w:r>
         <w:rPr>
           <w:b/>
@@ -552,7 +561,42 @@
           <w:sz w:val="20"/>
           <w:szCs w:val="20"/>
         </w:rPr>
-        <w:t>(basic), CI/CD concepts</w:t>
+        <w:t>(basic),</w:t>
+      </w:r>
+      <w:r>
+        <w:rPr>
+          <w:sz w:val="20"/>
+          <w:szCs w:val="20"/>
+        </w:rPr>
+        <w:t xml:space="preserve"> </w:t>
+      </w:r>
+      <w:r>
+        <w:rPr>
+          <w:sz w:val="20"/>
+          <w:szCs w:val="20"/>
+        </w:rPr>
+        <w:t>AI-Assisted Coding (Gemini CLI)</w:t>
+      </w:r>
+      <w:r>
+        <w:rPr>
+          <w:sz w:val="20"/>
+          <w:szCs w:val="20"/>
+        </w:rPr>
+        <w:t>,</w:t>
+      </w:r>
+      <w:r>
+        <w:rPr>
+          <w:sz w:val="20"/>
+          <w:szCs w:val="20"/>
+        </w:rPr>
+        <w:t xml:space="preserve"> </w:t>
+      </w:r>
+      <w:r>
+        <w:rPr>
+          <w:sz w:val="20"/>
+          <w:szCs w:val="20"/>
+        </w:rPr>
+        <w:t>CI/CD concepts</w:t>
       </w:r>
       <w:r>
         <w:rPr>
@@ -687,7 +731,25 @@
           <w:bCs/>
           <w:lang w:val="pt-BR"/>
         </w:rPr>
-        <w:t xml:space="preserve">Sales Assistant &amp; Automation </w:t>
+        <w:t xml:space="preserve">Sales </w:t>
+      </w:r>
+      <w:proofErr w:type="spellStart"/>
+      <w:r>
+        <w:rPr>
+          <w:b/>
+          <w:bCs/>
+          <w:lang w:val="pt-BR"/>
+        </w:rPr>
+        <w:t>Assistant</w:t>
+      </w:r>
+      <w:proofErr w:type="spellEnd"/>
+      <w:r>
+        <w:rPr>
+          <w:b/>
+          <w:bCs/>
+          <w:lang w:val="pt-BR"/>
+        </w:rPr>
+        <w:t xml:space="preserve"> &amp; Automation </w:t>
       </w:r>
       <w:proofErr w:type="spellStart"/>
       <w:r>
@@ -857,92 +919,7 @@
           <w:sz w:val="20"/>
           <w:szCs w:val="20"/>
         </w:rPr>
-        <w:t xml:space="preserve">Technically led a squad of 3 developers in the architecture and construction of </w:t>
-      </w:r>
-      <w:r>
-        <w:rPr>
-          <w:b/>
-          <w:bCs/>
-          <w:sz w:val="20"/>
-          <w:szCs w:val="20"/>
-        </w:rPr>
-        <w:t>scalable SPAs</w:t>
-      </w:r>
-      <w:r>
-        <w:rPr>
-          <w:sz w:val="20"/>
-          <w:szCs w:val="20"/>
-        </w:rPr>
-        <w:t xml:space="preserve">, guiding the team through </w:t>
-      </w:r>
-      <w:r>
-        <w:rPr>
-          <w:b/>
-          <w:bCs/>
-          <w:sz w:val="20"/>
-          <w:szCs w:val="20"/>
-        </w:rPr>
-        <w:t>Agile methodologies</w:t>
-      </w:r>
-      <w:r>
-        <w:rPr>
-          <w:sz w:val="20"/>
-          <w:szCs w:val="20"/>
-        </w:rPr>
-        <w:t xml:space="preserve">. </w:t>
-      </w:r>
-      <w:r>
-        <w:rPr>
-          <w:sz w:val="20"/>
-          <w:szCs w:val="20"/>
-        </w:rPr>
-        <w:t xml:space="preserve">Conducted </w:t>
-      </w:r>
-      <w:r>
-        <w:rPr>
-          <w:b/>
-          <w:bCs/>
-          <w:sz w:val="20"/>
-          <w:szCs w:val="20"/>
-        </w:rPr>
-        <w:t>code reviews</w:t>
-      </w:r>
-      <w:r>
-        <w:rPr>
-          <w:sz w:val="20"/>
-          <w:szCs w:val="20"/>
-        </w:rPr>
-        <w:t xml:space="preserve"> and architectural definitions, ensuring code standardization and adoption of software engineering best practices</w:t>
-      </w:r>
-      <w:r>
-        <w:rPr>
-          <w:sz w:val="20"/>
-          <w:szCs w:val="20"/>
-        </w:rPr>
-        <w:t xml:space="preserve">. </w:t>
-      </w:r>
-      <w:r>
-        <w:rPr>
-          <w:sz w:val="20"/>
-          <w:szCs w:val="20"/>
-        </w:rPr>
-        <w:t xml:space="preserve">Standardized the consumption and integration of </w:t>
-      </w:r>
-      <w:r>
-        <w:rPr>
-          <w:b/>
-          <w:bCs/>
-          <w:sz w:val="20"/>
-          <w:szCs w:val="20"/>
-        </w:rPr>
-        <w:t>RESTful APIs</w:t>
-      </w:r>
-      <w:r>
-        <w:rPr>
-          <w:sz w:val="20"/>
-          <w:szCs w:val="20"/>
-        </w:rPr>
-        <w:t xml:space="preserve"> with UI components, creating a scalable communication layer that facilitated maintenance and feature implementation</w:t>
+        <w:t>Led a squad of 3 developers in architecting and building scalable Single Page Applications (SPAs) using agile methodologies. Managed the code review process, reducing sprint bug rates and ensuring agile software delivery. Standardized RESTful API integration with UI components by creating a scalable communication layer, which facilitated maintenance and accelerated the addition of new features</w:t>
       </w:r>
       <w:r>
         <w:rPr>
@@ -1021,14 +998,25 @@
         </w:rPr>
         <w:t xml:space="preserve">. </w:t>
       </w:r>
-      <w:r>
-        <w:rPr>
-          <w:b/>
-          <w:bCs/>
-          <w:sz w:val="20"/>
-          <w:szCs w:val="20"/>
-        </w:rPr>
-        <w:t>Accelerated the development cycle by 40%</w:t>
+      <w:proofErr w:type="gramStart"/>
+      <w:r>
+        <w:rPr>
+          <w:b/>
+          <w:bCs/>
+          <w:sz w:val="20"/>
+          <w:szCs w:val="20"/>
+        </w:rPr>
+        <w:t>Accelerated the development cycle</w:t>
+      </w:r>
+      <w:proofErr w:type="gramEnd"/>
+      <w:r>
+        <w:rPr>
+          <w:b/>
+          <w:bCs/>
+          <w:sz w:val="20"/>
+          <w:szCs w:val="20"/>
+        </w:rPr>
+        <w:t xml:space="preserve"> by 40%</w:t>
       </w:r>
       <w:r>
         <w:rPr>
@@ -1324,85 +1312,23 @@
         <w:t xml:space="preserve">: </w:t>
       </w:r>
       <w:hyperlink r:id="rId10" w:history="1">
+        <w:proofErr w:type="spellStart"/>
         <w:r>
           <w:rPr>
             <w:rStyle w:val="Hyperlink"/>
             <w:sz w:val="20"/>
             <w:szCs w:val="20"/>
           </w:rPr>
-          <w:t>huannvictor/discord-clone</w:t>
+          <w:t>huannvictor</w:t>
         </w:r>
-      </w:hyperlink>
-    </w:p>
-    <w:p>
-      <w:pPr>
-        <w:spacing w:before="240" w:after="0" w:line="276" w:lineRule="auto"/>
-        <w:rPr>
-          <w:b/>
-          <w:bCs/>
-        </w:rPr>
-      </w:pPr>
-      <w:r>
-        <w:rPr>
-          <w:b/>
-          <w:bCs/>
-        </w:rPr>
-        <w:t>Micro-SaaS Template &amp; Backend Structure</w:t>
-      </w:r>
-    </w:p>
-    <w:p>
-      <w:pPr>
-        <w:spacing w:after="0" w:line="276" w:lineRule="auto"/>
-        <w:rPr>
-          <w:sz w:val="20"/>
-          <w:szCs w:val="20"/>
-        </w:rPr>
-      </w:pPr>
-      <w:r>
-        <w:rPr>
-          <w:sz w:val="20"/>
-          <w:szCs w:val="20"/>
-        </w:rPr>
-        <w:t>Robust API architecture using Node.js and TypeScript, focused on modularity and maintenance. Utilized PostgreSQL and ORMs (Prisma/Drizzle)</w:t>
-      </w:r>
-      <w:r>
-        <w:rPr>
-          <w:sz w:val="20"/>
-          <w:szCs w:val="20"/>
-        </w:rPr>
-        <w:t>.</w:t>
-      </w:r>
-    </w:p>
-    <w:p>
-      <w:pPr>
-        <w:spacing w:after="0" w:line="276" w:lineRule="auto"/>
-        <w:rPr>
-          <w:sz w:val="20"/>
-          <w:szCs w:val="20"/>
-        </w:rPr>
-      </w:pPr>
-      <w:r>
-        <w:rPr>
-          <w:sz w:val="20"/>
-          <w:szCs w:val="20"/>
-        </w:rPr>
-        <w:t>Repository</w:t>
-      </w:r>
-      <w:r>
-        <w:rPr>
-          <w:sz w:val="20"/>
-          <w:szCs w:val="20"/>
-        </w:rPr>
-        <w:t xml:space="preserve">: </w:t>
-      </w:r>
-      <w:hyperlink r:id="rId11" w:history="1">
+        <w:proofErr w:type="spellEnd"/>
         <w:r>
           <w:rPr>
             <w:rStyle w:val="Hyperlink"/>
             <w:sz w:val="20"/>
             <w:szCs w:val="20"/>
           </w:rPr>
-          <w:t>huannvictor/template-saas</w:t>
+          <w:t>/discord-clone</w:t>
         </w:r>
       </w:hyperlink>
     </w:p>
@@ -1419,21 +1345,7 @@
           <w:b/>
           <w:bCs/>
         </w:rPr>
-        <w:t>Assistant List Flow (</w:t>
-      </w:r>
-      <w:r>
-        <w:rPr>
-          <w:b/>
-          <w:bCs/>
-        </w:rPr>
-        <w:t>Intelligent Processing</w:t>
-      </w:r>
-      <w:r>
-        <w:rPr>
-          <w:b/>
-          <w:bCs/>
-        </w:rPr>
-        <w:t>)</w:t>
+        <w:t>Micro-SaaS Template &amp; Backend Structure</w:t>
       </w:r>
     </w:p>
     <w:p>
@@ -1449,7 +1361,7 @@
           <w:sz w:val="20"/>
           <w:szCs w:val="20"/>
         </w:rPr>
-        <w:t>Python automation system for document conversion and metadata extraction, integrating legacy systems with modern technologies. Reduced manual task time by over 70%</w:t>
+        <w:t>Robust API architecture using Node.js and TypeScript, focused on modularity and maintenance. Utilized PostgreSQL and ORMs (Prisma/Drizzle)</w:t>
       </w:r>
       <w:r>
         <w:rPr>
@@ -1481,15 +1393,141 @@
         </w:rPr>
         <w:t xml:space="preserve">: </w:t>
       </w:r>
-      <w:hyperlink r:id="rId12" w:history="1">
+      <w:hyperlink r:id="rId11" w:history="1">
+        <w:proofErr w:type="spellStart"/>
         <w:r>
           <w:rPr>
             <w:rStyle w:val="Hyperlink"/>
             <w:sz w:val="20"/>
             <w:szCs w:val="20"/>
           </w:rPr>
-          <w:t>huannvictor/AssistantListFlow</w:t>
+          <w:t>huannvictor</w:t>
         </w:r>
+        <w:proofErr w:type="spellEnd"/>
+        <w:r>
+          <w:rPr>
+            <w:rStyle w:val="Hyperlink"/>
+            <w:sz w:val="20"/>
+            <w:szCs w:val="20"/>
+          </w:rPr>
+          <w:t>/template-</w:t>
+        </w:r>
+        <w:proofErr w:type="spellStart"/>
+        <w:r>
+          <w:rPr>
+            <w:rStyle w:val="Hyperlink"/>
+            <w:sz w:val="20"/>
+            <w:szCs w:val="20"/>
+          </w:rPr>
+          <w:t>saas</w:t>
+        </w:r>
+        <w:proofErr w:type="spellEnd"/>
+      </w:hyperlink>
+    </w:p>
+    <w:p>
+      <w:pPr>
+        <w:spacing w:before="240" w:after="0" w:line="276" w:lineRule="auto"/>
+        <w:rPr>
+          <w:b/>
+          <w:bCs/>
+        </w:rPr>
+      </w:pPr>
+      <w:r>
+        <w:rPr>
+          <w:b/>
+          <w:bCs/>
+        </w:rPr>
+        <w:t>Assistant List Flow (</w:t>
+      </w:r>
+      <w:r>
+        <w:rPr>
+          <w:b/>
+          <w:bCs/>
+        </w:rPr>
+        <w:t>Intelligent Processing</w:t>
+      </w:r>
+      <w:r>
+        <w:rPr>
+          <w:b/>
+          <w:bCs/>
+        </w:rPr>
+        <w:t>)</w:t>
+      </w:r>
+    </w:p>
+    <w:p>
+      <w:pPr>
+        <w:spacing w:after="0" w:line="276" w:lineRule="auto"/>
+        <w:rPr>
+          <w:sz w:val="20"/>
+          <w:szCs w:val="20"/>
+        </w:rPr>
+      </w:pPr>
+      <w:r>
+        <w:rPr>
+          <w:sz w:val="20"/>
+          <w:szCs w:val="20"/>
+        </w:rPr>
+        <w:t>Python automation system for document conversion and metadata extraction, integrating legacy systems with modern technologies. Reduced manual task time by over 70%</w:t>
+      </w:r>
+      <w:r>
+        <w:rPr>
+          <w:sz w:val="20"/>
+          <w:szCs w:val="20"/>
+        </w:rPr>
+        <w:t>.</w:t>
+      </w:r>
+    </w:p>
+    <w:p>
+      <w:pPr>
+        <w:spacing w:after="0" w:line="276" w:lineRule="auto"/>
+        <w:rPr>
+          <w:sz w:val="20"/>
+          <w:szCs w:val="20"/>
+        </w:rPr>
+      </w:pPr>
+      <w:r>
+        <w:rPr>
+          <w:sz w:val="20"/>
+          <w:szCs w:val="20"/>
+        </w:rPr>
+        <w:t>Repository</w:t>
+      </w:r>
+      <w:r>
+        <w:rPr>
+          <w:sz w:val="20"/>
+          <w:szCs w:val="20"/>
+        </w:rPr>
+        <w:t xml:space="preserve">: </w:t>
+      </w:r>
+      <w:hyperlink r:id="rId12" w:history="1">
+        <w:proofErr w:type="spellStart"/>
+        <w:r>
+          <w:rPr>
+            <w:rStyle w:val="Hyperlink"/>
+            <w:sz w:val="20"/>
+            <w:szCs w:val="20"/>
+          </w:rPr>
+          <w:t>huannvictor</w:t>
+        </w:r>
+        <w:proofErr w:type="spellEnd"/>
+        <w:r>
+          <w:rPr>
+            <w:rStyle w:val="Hyperlink"/>
+            <w:sz w:val="20"/>
+            <w:szCs w:val="20"/>
+          </w:rPr>
+          <w:t>/</w:t>
+        </w:r>
+        <w:proofErr w:type="spellStart"/>
+        <w:r>
+          <w:rPr>
+            <w:rStyle w:val="Hyperlink"/>
+            <w:sz w:val="20"/>
+            <w:szCs w:val="20"/>
+          </w:rPr>
+          <w:t>AssistantListFlow</w:t>
+        </w:r>
+        <w:proofErr w:type="spellEnd"/>
       </w:hyperlink>
     </w:p>
     <w:p>
@@ -1988,16 +2026,6 @@
         </w:rPr>
         <w:t>Wyden</w:t>
       </w:r>
-      <w:r>
-        <w:rPr>
-          <w:b/>
-          <w:bCs/>
-        </w:rPr>
-        <w:t xml:space="preserve"> | </w:t>
-      </w:r>
-      <w:r>
-        <w:t>(In Progress)</w:t>
-      </w:r>
     </w:p>
     <w:p>
       <w:pPr>
@@ -2013,6 +2041,106 @@
           <w:szCs w:val="20"/>
         </w:rPr>
         <w:t>Studies focused on algorithms, logic, data structures, requirements analysis, and modern web development</w:t>
+      </w:r>
+      <w:r>
+        <w:rPr>
+          <w:sz w:val="20"/>
+          <w:szCs w:val="20"/>
+        </w:rPr>
+        <w:t>.</w:t>
+      </w:r>
+    </w:p>
+    <w:p>
+      <w:pPr>
+        <w:spacing w:before="240" w:after="0" w:line="276" w:lineRule="auto"/>
+      </w:pPr>
+      <w:r>
+        <w:rPr>
+          <w:b/>
+          <w:bCs/>
+        </w:rPr>
+        <w:t>(2026 – 2027) MBA in Software Engineering | FAMEF</w:t>
+      </w:r>
+      <w:r>
+        <w:rPr>
+          <w:b/>
+          <w:bCs/>
+        </w:rPr>
+        <w:t xml:space="preserve"> </w:t>
+      </w:r>
+    </w:p>
+    <w:p>
+      <w:pPr>
+        <w:spacing w:after="0" w:line="276" w:lineRule="auto"/>
+        <w:rPr>
+          <w:sz w:val="20"/>
+          <w:szCs w:val="20"/>
+        </w:rPr>
+      </w:pPr>
+      <w:r>
+        <w:rPr>
+          <w:sz w:val="20"/>
+          <w:szCs w:val="20"/>
+        </w:rPr>
+        <w:t>Focused on the Software Development Life Cycle (SDLC), requirements engineering, object-oriented modeling (UML), unit testing, and software quality</w:t>
+      </w:r>
+      <w:r>
+        <w:rPr>
+          <w:sz w:val="20"/>
+          <w:szCs w:val="20"/>
+        </w:rPr>
+        <w:t>.</w:t>
+      </w:r>
+    </w:p>
+    <w:p>
+      <w:pPr>
+        <w:spacing w:before="240" w:after="0" w:line="276" w:lineRule="auto"/>
+      </w:pPr>
+      <w:r>
+        <w:rPr>
+          <w:b/>
+          <w:bCs/>
+        </w:rPr>
+        <w:t>(</w:t>
+      </w:r>
+      <w:r>
+        <w:rPr>
+          <w:b/>
+          <w:bCs/>
+        </w:rPr>
+        <w:t>2026 – 2027) MBA in Cybersecurity | FAMEF</w:t>
+      </w:r>
+    </w:p>
+    <w:p>
+      <w:pPr>
+        <w:spacing w:after="0" w:line="276" w:lineRule="auto"/>
+        <w:rPr>
+          <w:sz w:val="20"/>
+          <w:szCs w:val="20"/>
+        </w:rPr>
+      </w:pPr>
+      <w:r>
+        <w:rPr>
+          <w:sz w:val="20"/>
+          <w:szCs w:val="20"/>
+        </w:rPr>
+        <w:t xml:space="preserve">Focused on secure development (OWASP, SDLC), </w:t>
+      </w:r>
+      <w:proofErr w:type="spellStart"/>
+      <w:r>
+        <w:rPr>
+          <w:sz w:val="20"/>
+          <w:szCs w:val="20"/>
+        </w:rPr>
+        <w:t>DevSecOps</w:t>
+      </w:r>
+      <w:proofErr w:type="spellEnd"/>
+      <w:r>
+        <w:rPr>
+          <w:sz w:val="20"/>
+          <w:szCs w:val="20"/>
+        </w:rPr>
+        <w:t xml:space="preserve"> culture, cloud security (AWS), and vulnerability management</w:t>
       </w:r>
       <w:r>
         <w:rPr>
@@ -5212,7 +5340,7 @@
   <w:style w:type="paragraph" w:default="1" w:styleId="Normal">
     <w:name w:val="Normal"/>
     <w:qFormat/>
-    <w:rsid w:val="0008318D"/>
+    <w:rsid w:val="000B22DB"/>
     <w:rPr>
       <w:lang w:val="en-US"/>
     </w:rPr>
@@ -5417,7 +5545,6 @@
   <w:style w:type="character" w:default="1" w:styleId="Fontepargpadro">
     <w:name w:val="Default Paragraph Font"/>
     <w:uiPriority w:val="1"/>
-    <w:semiHidden/>
     <w:unhideWhenUsed/>
   </w:style>
   <w:style w:type="table" w:default="1" w:styleId="Tabelanormal">

</xml_diff>